<commit_message>
feat: implement student and enrollment management features with backend services, frontend pages, and build assets
</commit_message>
<xml_diff>
--- a/Apni_Vidya_User_Journey_and_Demo_Manual.docx
+++ b/Apni_Vidya_User_Journey_and_Demo_Manual.docx
@@ -703,20 +703,7 @@
         <w:spacing w:before="40" w:after="80"/>
       </w:pPr>
       <w:r>
-        <w:rPr>
-          <w:rFonts w:ascii="Calibri" w:hAnsi="Calibri"/>
-          <w:b/>
-          <w:sz w:val="21"/>
-        </w:rPr>
-        <w:t xml:space="preserve">What You See on Screen: </w:t>
-      </w:r>
-      <w:r>
-        <w:rPr>
-          <w:rFonts w:ascii="Calibri" w:hAnsi="Calibri"/>
-          <w:color w:val="334155"/>
-          <w:sz w:val="21"/>
-        </w:rPr>
-        <w:t>Comprehensive student database table with columns for Student Name, Email, Phone Number, Assigned Batch, and Active Status.</w:t>
+        <w:t>What You See on Screen: Comprehensive student database table with columns for Student Name, Email, Phone Number, Assigned Batch, and Active Status, plus quick actions for Bulk Admission, Excel template download, and instant Password Reset.</w:t>
       </w:r>
     </w:p>
     <w:p>
@@ -793,6 +780,30 @@
           <w:sz w:val="20"/>
         </w:rPr>
         <w:t>: Instantly creates the record and generates student login credentials.</w:t>
+      </w:r>
+    </w:p>
+    <w:p>
+      <w:pPr>
+        <w:pStyle w:val="ListBullet"/>
+      </w:pPr>
+      <w:r>
+        <w:t>Bulk Student Admission via Excel/CSV: Click the Bulk Admit / Import button to enroll dozens or hundreds of students simultaneously. Download the pre-formatted Excel template, paste student names, phone numbers, parent contacts, and batch selections, and upload for 1-click batch admission.</w:t>
+      </w:r>
+    </w:p>
+    <w:p>
+      <w:pPr>
+        <w:pStyle w:val="ListBullet"/>
+      </w:pPr>
+      <w:r>
+        <w:t>Auto-Generated One-Time Credentials Modal: Immediately after single or bulk admission, a secure modal displays student and parent temporary passwords with 1-click 'Copy All' and 'Download Excel' for effortless distribution via WhatsApp or SMS.</w:t>
+      </w:r>
+    </w:p>
+    <w:p>
+      <w:pPr>
+        <w:pStyle w:val="ListBullet"/>
+      </w:pPr>
+      <w:r>
+        <w:t>Admin Student Password Reset: On any student row or inside the student profile drawer, click 'Reset Password'. Generates a fresh temporary password and enforces 'must_reset_password: true', requiring the student to create their own private password upon first login.</w:t>
       </w:r>
     </w:p>
     <w:p>
@@ -837,25 +848,8 @@
             </w:tcBorders>
           </w:tcPr>
           <w:p>
-            <w:pPr>
-              <w:spacing w:before="0" w:after="80"/>
-            </w:pPr>
             <w:r>
-              <w:rPr>
-                <w:rFonts w:ascii="Calibri" w:hAnsi="Calibri"/>
-                <w:b/>
-                <w:color w:val="4F46E5"/>
-                <w:sz w:val="21"/>
-              </w:rPr>
-              <w:t xml:space="preserve">★ WHY THIS IMPRESSES VIEWERS: </w:t>
-            </w:r>
-            <w:r>
-              <w:rPr>
-                <w:rFonts w:ascii="Calibri" w:hAnsi="Calibri"/>
-                <w:color w:val="1E293B"/>
-                <w:sz w:val="21"/>
-              </w:rPr>
-              <w:t>Centralized student records. Never lose a parent's contact number or confuse which student belongs to which batch.</w:t>
+              <w:t>★ WHY THIS IMPRESSES VIEWERS: Centralized student records with bulk Excel import, instant temporary credential generation, and 1-click password resets. Never lose a parent's contact number or scramble to recover forgotten student passwords.</w:t>
             </w:r>
           </w:p>
         </w:tc>
@@ -1078,13 +1072,7 @@
         <w:spacing w:before="280" w:after="80"/>
       </w:pPr>
       <w:r>
-        <w:rPr>
-          <w:rFonts w:ascii="Calibri" w:hAnsi="Calibri"/>
-          <w:b/>
-          <w:color w:val="1E3A8A"/>
-          <w:sz w:val="28"/>
-        </w:rPr>
-        <w:t>Step 2.4: Public Admission Links &amp; Enrollment Requests</w:t>
+        <w:t>Step 2.4: Hybrid QR Code &amp; Batch-Specific Enrollment System</w:t>
       </w:r>
     </w:p>
     <w:p>
@@ -1115,96 +1103,63 @@
         <w:spacing w:before="40" w:after="80"/>
       </w:pPr>
       <w:r>
+        <w:t>What You See on Screen: Queue of incoming student admission applications grouped batch-wise, an inline Batch Selector dropdown for each pending student, and top-bar actions to Copy Public Link, Open Form, and View QR &amp; Links.</w:t>
+      </w:r>
+    </w:p>
+    <w:p>
+      <w:pPr>
+        <w:spacing w:before="80" w:after="120"/>
+      </w:pPr>
+      <w:r>
         <w:rPr>
           <w:rFonts w:ascii="Calibri" w:hAnsi="Calibri"/>
           <w:b/>
           <w:sz w:val="21"/>
         </w:rPr>
-        <w:t xml:space="preserve">What You See on Screen: </w:t>
-      </w:r>
-      <w:r>
-        <w:rPr>
-          <w:rFonts w:ascii="Calibri" w:hAnsi="Calibri"/>
-          <w:color w:val="334155"/>
-          <w:sz w:val="21"/>
-        </w:rPr>
-        <w:t>Queue of incoming student admission applications submitted online through the institute's public admissions URL.</w:t>
+        <w:t xml:space="preserve">Exact Buttons to Touch &amp; Actions: </w:t>
+        <w:br/>
       </w:r>
     </w:p>
     <w:p>
       <w:pPr>
-        <w:spacing w:before="80" w:after="120"/>
-      </w:pPr>
-      <w:r>
-        <w:rPr>
-          <w:rFonts w:ascii="Calibri" w:hAnsi="Calibri"/>
-          <w:b/>
-          <w:sz w:val="21"/>
-        </w:rPr>
-        <w:t xml:space="preserve">Exact Buttons to Touch &amp; Actions: </w:t>
-        <w:br/>
+        <w:pStyle w:val="ListBullet"/>
+        <w:spacing w:before="0" w:after="60"/>
+      </w:pPr>
+      <w:r>
+        <w:t>Point to the 📱 View QR &amp; Links button: Opens the Hybrid QR Code &amp; Admissions Link modal with options for both general and batch-specific onboarding.</w:t>
       </w:r>
     </w:p>
     <w:p>
       <w:pPr>
         <w:pStyle w:val="ListBullet"/>
-        <w:spacing w:before="0" w:after="60"/>
-      </w:pPr>
-      <w:r>
-        <w:rPr>
-          <w:rFonts w:ascii="Calibri" w:hAnsi="Calibri"/>
-          <w:color w:val="334155"/>
-          <w:sz w:val="20"/>
-        </w:rPr>
-        <w:t xml:space="preserve">Point to the </w:t>
-      </w:r>
-      <w:r>
-        <w:rPr>
-          <w:rFonts w:ascii="Calibri" w:hAnsi="Calibri"/>
-          <w:b/>
-          <w:color w:val="4F46E5"/>
-          <w:sz w:val="20"/>
-        </w:rPr>
-        <w:t>Copy Public Admission Link</w:t>
-      </w:r>
-      <w:r>
-        <w:rPr>
-          <w:rFonts w:ascii="Calibri" w:hAnsi="Calibri"/>
-          <w:color w:val="334155"/>
-          <w:sz w:val="20"/>
-        </w:rPr>
-        <w:t xml:space="preserve"> button: Explain that the institute can paste this link on WhatsApp, Instagram, or their website.</w:t>
+      </w:pPr>
+      <w:r>
+        <w:t>General Institute QR &amp; Link (/enroll/&lt;slug&gt;): Display on reception counters, printed brochures, or the academy website. Students scan it on mobile, view institute branding, and choose their desired batch from an active dropdown list.</w:t>
       </w:r>
     </w:p>
     <w:p>
       <w:pPr>
         <w:pStyle w:val="ListBullet"/>
+      </w:pPr>
+      <w:r>
+        <w:t>Direct Batch Links &amp; QR (/enroll/&lt;slug&gt;?batch=&lt;id&gt;): Select any specific batch from the modal to generate a pre-targeted link. Ideal for batch-specific promotional WhatsApp groups, Instagram ads, or flyers where the batch is automatically pre-selected.</w:t>
+      </w:r>
+    </w:p>
+    <w:p>
+      <w:pPr>
+        <w:pStyle w:val="ListBullet"/>
+      </w:pPr>
+      <w:r>
+        <w:t>Admin Batch Override on Approval: If a student accidentally picked the wrong batch (e.g., Morning instead of Evening Droppers), the admin simply selects the correct batch from the inline dropdown in the table before clicking 'Approve'.</w:t>
+      </w:r>
+    </w:p>
+    <w:p>
+      <w:pPr>
+        <w:pStyle w:val="ListBullet"/>
         <w:spacing w:before="0" w:after="60"/>
       </w:pPr>
       <w:r>
-        <w:rPr>
-          <w:rFonts w:ascii="Calibri" w:hAnsi="Calibri"/>
-          <w:color w:val="334155"/>
-          <w:sz w:val="20"/>
-        </w:rPr>
-        <w:t xml:space="preserve">On any pending applicant card, point to the green </w:t>
-      </w:r>
-      <w:r>
-        <w:rPr>
-          <w:rFonts w:ascii="Calibri" w:hAnsi="Calibri"/>
-          <w:b/>
-          <w:color w:val="4F46E5"/>
-          <w:sz w:val="20"/>
-        </w:rPr>
-        <w:t>Approve</w:t>
-      </w:r>
-      <w:r>
-        <w:rPr>
-          <w:rFonts w:ascii="Calibri" w:hAnsi="Calibri"/>
-          <w:color w:val="334155"/>
-          <w:sz w:val="20"/>
-        </w:rPr>
-        <w:t xml:space="preserve"> button: 1-click automatically converts the lead into an active student and assigns them to a batch.</w:t>
+        <w:t>One-Click Approval &amp; Credentials Modal: Clicking the green 'Approve' button admits the student into the chosen batch and immediately displays their temporary login credentials with a 1-click 'Copy All' button and automatic welcome email dispatch.</w:t>
       </w:r>
     </w:p>
     <w:p>
@@ -1266,25 +1221,8 @@
             </w:tcBorders>
           </w:tcPr>
           <w:p>
-            <w:pPr>
-              <w:spacing w:before="0" w:after="80"/>
-            </w:pPr>
             <w:r>
-              <w:rPr>
-                <w:rFonts w:ascii="Calibri" w:hAnsi="Calibri"/>
-                <w:b/>
-                <w:color w:val="4F46E5"/>
-                <w:sz w:val="21"/>
-              </w:rPr>
-              <w:t xml:space="preserve">★ WHY THIS IMPRESSES VIEWERS: </w:t>
-            </w:r>
-            <w:r>
-              <w:rPr>
-                <w:rFonts w:ascii="Calibri" w:hAnsi="Calibri"/>
-                <w:color w:val="1E293B"/>
-                <w:sz w:val="21"/>
-              </w:rPr>
-              <w:t>Automates student admissions. Prospective students apply from home via mobile, and the admin enrolls them with a single click.</w:t>
+              <w:t>★ WHY THIS IMPRESSES VIEWERS: Hybrid admissions automation. Students self-enroll via physical reception QR codes or batch-specific WhatsApp links, and the admin approves them with full batch-override control and instant credential delivery.</w:t>
             </w:r>
           </w:p>
         </w:tc>
@@ -1442,6 +1380,14 @@
           <w:sz w:val="20"/>
         </w:rPr>
         <w:t>: Establishes the cohort so all future tests, attendance, and notes are targeted precisely to these students.</w:t>
+      </w:r>
+    </w:p>
+    <w:p>
+      <w:pPr>
+        <w:pStyle w:val="ListBullet"/>
+      </w:pPr>
+      <w:r>
+        <w:t>Direct Batch Link &amp; QR Sharing: On any batch card or dashboard, click '🔗 Copy Batch Link' or view the Batch Enrollment QR card to copy the direct student registration URL (/enroll/&lt;slug&gt;?batch=&lt;id&gt;) in one click.</w:t>
       </w:r>
     </w:p>
     <w:tbl>
@@ -7675,6 +7621,90 @@
           </w:p>
         </w:tc>
       </w:tr>
+      <w:tr>
+        <w:tc>
+          <w:tcPr>
+            <w:tcW w:type="dxa" w:w="2340"/>
+          </w:tcPr>
+          <w:p>
+            <w:r>
+              <w:t>Student Admissions</w:t>
+            </w:r>
+          </w:p>
+        </w:tc>
+        <w:tc>
+          <w:tcPr>
+            <w:tcW w:type="dxa" w:w="2340"/>
+          </w:tcPr>
+          <w:p>
+            <w:r>
+              <w:t>Bulk Excel import, hybrid QR/links, batch override, instant credential export</w:t>
+            </w:r>
+          </w:p>
+        </w:tc>
+        <w:tc>
+          <w:tcPr>
+            <w:tcW w:type="dxa" w:w="2340"/>
+          </w:tcPr>
+          <w:p>
+            <w:r>
+              <w:t>View enrolled batch rosters &amp; student profiles</w:t>
+            </w:r>
+          </w:p>
+        </w:tc>
+        <w:tc>
+          <w:tcPr>
+            <w:tcW w:type="dxa" w:w="2340"/>
+          </w:tcPr>
+          <w:p>
+            <w:r>
+              <w:t>Self-enroll via QR/link, choose batch from dropdown</w:t>
+            </w:r>
+          </w:p>
+        </w:tc>
+      </w:tr>
+      <w:tr>
+        <w:tc>
+          <w:tcPr>
+            <w:tcW w:type="dxa" w:w="2340"/>
+          </w:tcPr>
+          <w:p>
+            <w:r>
+              <w:t>Credential Security</w:t>
+            </w:r>
+          </w:p>
+        </w:tc>
+        <w:tc>
+          <w:tcPr>
+            <w:tcW w:type="dxa" w:w="2340"/>
+          </w:tcPr>
+          <w:p>
+            <w:r>
+              <w:t>1-click student password resets, copy credentials, force first-login password change</w:t>
+            </w:r>
+          </w:p>
+        </w:tc>
+        <w:tc>
+          <w:tcPr>
+            <w:tcW w:type="dxa" w:w="2340"/>
+          </w:tcPr>
+          <w:p>
+            <w:r>
+              <w:t>Protected role-based login</w:t>
+            </w:r>
+          </w:p>
+        </w:tc>
+        <w:tc>
+          <w:tcPr>
+            <w:tcW w:type="dxa" w:w="2340"/>
+          </w:tcPr>
+          <w:p>
+            <w:r>
+              <w:t>Mandatory first-login password change for privacy</w:t>
+            </w:r>
+          </w:p>
+        </w:tc>
+      </w:tr>
     </w:tbl>
     <w:p/>
     <w:p>

</xml_diff>